<commit_message>
Update docs for the markets page, paper orders, and clarify step
Co-authored-by: Cursor <cursoragent@cursor.com>
</commit_message>
<xml_diff>
--- a/DocumentsAndDiagrams/docx/CURRENT_DATABASE_ARCHITECTURE.docx
+++ b/DocumentsAndDiagrams/docx/CURRENT_DATABASE_ARCHITECTURE.docx
@@ -65,7 +65,7 @@
           <w:spacing w:val="0"/>
           <w:color w:val="151312"/>
         </w:rPr>
-        <w:t xml:space="preserve">Analysis date: 2026-10-08.</w:t>
+        <w:t xml:space="preserve">Analysis date: 2026-10-10.</w:t>
       </w:r>
     </w:p>
     <w:p>
@@ -252,7 +252,7 @@
           <w:spacing w:val="0"/>
           <w:color w:val="151312"/>
         </w:rPr>
-        <w:t xml:space="preserve">0005_sim_v3</w:t>
+        <w:t xml:space="preserve">0006_paper_orders</w:t>
       </w:r>
       <w:r>
         <w:rPr>
@@ -1349,6 +1349,26 @@
           <w:spacing w:val="0"/>
           <w:color w:val="151312"/>
         </w:rPr>
+        <w:t xml:space="preserve"> → </w:t>
+      </w:r>
+      <w:r>
+        <w:rPr>
+          <w:rFonts w:ascii=".AppleSystemUIFontMonospaced" w:hAnsi=".AppleSystemUIFontMonospaced" w:cs=".AppleSystemUIFontMonospaced"/>
+          <w:sz w:val="23"/>
+          <w:sz-cs w:val="23"/>
+          <w:spacing w:val="0"/>
+          <w:color w:val="151312"/>
+        </w:rPr>
+        <w:t xml:space="preserve">0006_paper_orders</w:t>
+      </w:r>
+      <w:r>
+        <w:rPr>
+          <w:rFonts w:ascii="Helvetica" w:hAnsi="Helvetica" w:cs="Helvetica"/>
+          <w:sz w:val="25"/>
+          <w:sz-cs w:val="25"/>
+          <w:spacing w:val="0"/>
+          <w:color w:val="151312"/>
+        </w:rPr>
         <w:t xml:space="preserve">.</w:t>
       </w:r>
     </w:p>
@@ -3276,6 +3296,114 @@
           <w:spacing w:val="0"/>
           <w:color w:val="151312"/>
         </w:rPr>
+        <w:t xml:space="preserve">paper_orders</w:t>
+      </w:r>
+      <w:r>
+        <w:rPr>
+          <w:rFonts w:ascii="Helvetica" w:hAnsi="Helvetica" w:cs="Helvetica"/>
+          <w:sz w:val="25"/>
+          <w:sz-cs w:val="25"/>
+          <w:spacing w:val="0"/>
+          <w:color w:val="151312"/>
+        </w:rPr>
+        <w:t xml:space="preserve"/>
+      </w:r>
+    </w:p>
+    <w:p>
+      <w:pPr/>
+      <w:r>
+        <w:rPr>
+          <w:rFonts w:ascii=".AppleSystemUIFontMonospaced" w:hAnsi=".AppleSystemUIFontMonospaced" w:cs=".AppleSystemUIFontMonospaced"/>
+          <w:sz w:val="23"/>
+          <w:sz-cs w:val="23"/>
+          <w:spacing w:val="0"/>
+          <w:color w:val="151312"/>
+        </w:rPr>
+        <w:t xml:space="preserve">PaperOrder</w:t>
+      </w:r>
+      <w:r>
+        <w:rPr>
+          <w:rFonts w:ascii="Helvetica" w:hAnsi="Helvetica" w:cs="Helvetica"/>
+          <w:sz w:val="25"/>
+          <w:sz-cs w:val="25"/>
+          <w:spacing w:val="0"/>
+          <w:color w:val="151312"/>
+        </w:rPr>
+        <w:t xml:space="preserve"/>
+      </w:r>
+    </w:p>
+    <w:p>
+      <w:pPr/>
+      <w:r>
+        <w:rPr>
+          <w:rFonts w:ascii=".AppleSystemUIFontMonospaced" w:hAnsi=".AppleSystemUIFontMonospaced" w:cs=".AppleSystemUIFontMonospaced"/>
+          <w:sz w:val="23"/>
+          <w:sz-cs w:val="23"/>
+          <w:spacing w:val="0"/>
+          <w:color w:val="151312"/>
+        </w:rPr>
+        <w:t xml:space="preserve">0006</w:t>
+      </w:r>
+      <w:r>
+        <w:rPr>
+          <w:rFonts w:ascii="Helvetica" w:hAnsi="Helvetica" w:cs="Helvetica"/>
+          <w:sz w:val="25"/>
+          <w:sz-cs w:val="25"/>
+          <w:spacing w:val="0"/>
+          <w:color w:val="151312"/>
+        </w:rPr>
+        <w:t xml:space="preserve"/>
+      </w:r>
+    </w:p>
+    <w:p>
+      <w:pPr/>
+      <w:r>
+        <w:rPr>
+          <w:rFonts w:ascii="Helvetica" w:hAnsi="Helvetica" w:cs="Helvetica"/>
+          <w:sz w:val="25"/>
+          <w:sz-cs w:val="25"/>
+          <w:spacing w:val="0"/>
+          <w:color w:val="151312"/>
+        </w:rPr>
+        <w:t xml:space="preserve">—</w:t>
+      </w:r>
+    </w:p>
+    <w:p>
+      <w:pPr/>
+      <w:r>
+        <w:rPr>
+          <w:rFonts w:ascii="Helvetica" w:hAnsi="Helvetica" w:cs="Helvetica"/>
+          <w:sz w:val="25"/>
+          <w:sz-cs w:val="25"/>
+          <w:spacing w:val="0"/>
+          <w:color w:val="151312"/>
+        </w:rPr>
+        <w:t xml:space="preserve">CORE</w:t>
+      </w:r>
+    </w:p>
+    <w:p>
+      <w:pPr/>
+      <w:r>
+        <w:rPr>
+          <w:rFonts w:ascii="Helvetica" w:hAnsi="Helvetica" w:cs="Helvetica"/>
+          <w:sz w:val="25"/>
+          <w:sz-cs w:val="25"/>
+          <w:spacing w:val="0"/>
+          <w:color w:val="151312"/>
+        </w:rPr>
+        <w:t xml:space="preserve">One manual paper order from the markets screen</w:t>
+      </w:r>
+    </w:p>
+    <w:p>
+      <w:pPr/>
+      <w:r>
+        <w:rPr>
+          <w:rFonts w:ascii=".AppleSystemUIFontMonospaced" w:hAnsi=".AppleSystemUIFontMonospaced" w:cs=".AppleSystemUIFontMonospaced"/>
+          <w:sz w:val="23"/>
+          <w:sz-cs w:val="23"/>
+          <w:spacing w:val="0"/>
+          <w:color w:val="151312"/>
+        </w:rPr>
         <w:t xml:space="preserve">trade_journal</w:t>
       </w:r>
       <w:r>
@@ -16782,7 +16910,7 @@
           <w:spacing w:val="0"/>
           <w:color w:val="151312"/>
         </w:rPr>
-        <w:t xml:space="preserve">audit_events</w:t>
+        <w:t xml:space="preserve">paper_orders</w:t>
       </w:r>
       <w:r>
         <w:rPr>
@@ -16793,8 +16921,1182 @@
           <w:spacing w:val="0"/>
           <w:color w:val="151312"/>
         </w:rPr>
-        <w:t xml:space="preserve"> and </w:t>
-      </w:r>
+        <w:t xml:space="preserve"/>
+      </w:r>
+    </w:p>
+    <w:p>
+      <w:pPr>
+        <w:spacing w:after="250"/>
+      </w:pPr>
+      <w:r>
+        <w:rPr>
+          <w:rFonts w:ascii="Helvetica" w:hAnsi="Helvetica" w:cs="Helvetica"/>
+          <w:sz w:val="25"/>
+          <w:sz-cs w:val="25"/>
+          <w:spacing w:val="0"/>
+          <w:color w:val="151312"/>
+        </w:rPr>
+        <w:t xml:space="preserve">Positions are not stored. </w:t>
+      </w:r>
+      <w:r>
+        <w:rPr>
+          <w:rFonts w:ascii=".AppleSystemUIFontMonospaced" w:hAnsi=".AppleSystemUIFontMonospaced" w:cs=".AppleSystemUIFontMonospaced"/>
+          <w:sz w:val="23"/>
+          <w:sz-cs w:val="23"/>
+          <w:spacing w:val="0"/>
+          <w:color w:val="151312"/>
+        </w:rPr>
+        <w:t xml:space="preserve">GET /api/paper/positions</w:t>
+      </w:r>
+      <w:r>
+        <w:rPr>
+          <w:rFonts w:ascii="Helvetica" w:hAnsi="Helvetica" w:cs="Helvetica"/>
+          <w:sz w:val="25"/>
+          <w:sz-cs w:val="25"/>
+          <w:spacing w:val="0"/>
+          <w:color w:val="151312"/>
+        </w:rPr>
+        <w:t xml:space="preserve"> nets these rows by contract.</w:t>
+      </w:r>
+    </w:p>
+    <w:p>
+      <w:pPr/>
+      <w:r>
+        <w:rPr>
+          <w:rFonts w:ascii="Helvetica" w:hAnsi="Helvetica" w:cs="Helvetica"/>
+          <w:sz w:val="25"/>
+          <w:sz-cs w:val="25"/>
+          <w:b/>
+          <w:spacing w:val="0"/>
+          <w:color w:val="151312"/>
+        </w:rPr>
+        <w:t xml:space="preserve">Column</w:t>
+      </w:r>
+    </w:p>
+    <w:p>
+      <w:pPr/>
+      <w:r>
+        <w:rPr>
+          <w:rFonts w:ascii="Helvetica" w:hAnsi="Helvetica" w:cs="Helvetica"/>
+          <w:sz w:val="25"/>
+          <w:sz-cs w:val="25"/>
+          <w:b/>
+          <w:spacing w:val="0"/>
+          <w:color w:val="151312"/>
+        </w:rPr>
+        <w:t xml:space="preserve">Type</w:t>
+      </w:r>
+    </w:p>
+    <w:p>
+      <w:pPr/>
+      <w:r>
+        <w:rPr>
+          <w:rFonts w:ascii="Helvetica" w:hAnsi="Helvetica" w:cs="Helvetica"/>
+          <w:sz w:val="25"/>
+          <w:sz-cs w:val="25"/>
+          <w:b/>
+          <w:spacing w:val="0"/>
+          <w:color w:val="151312"/>
+        </w:rPr>
+        <w:t xml:space="preserve">Null</w:t>
+      </w:r>
+    </w:p>
+    <w:p>
+      <w:pPr/>
+      <w:r>
+        <w:rPr>
+          <w:rFonts w:ascii="Helvetica" w:hAnsi="Helvetica" w:cs="Helvetica"/>
+          <w:sz w:val="25"/>
+          <w:sz-cs w:val="25"/>
+          <w:b/>
+          <w:spacing w:val="0"/>
+          <w:color w:val="151312"/>
+        </w:rPr>
+        <w:t xml:space="preserve">Notes</w:t>
+      </w:r>
+    </w:p>
+    <w:p>
+      <w:pPr/>
+      <w:r>
+        <w:rPr>
+          <w:rFonts w:ascii=".AppleSystemUIFontMonospaced" w:hAnsi=".AppleSystemUIFontMonospaced" w:cs=".AppleSystemUIFontMonospaced"/>
+          <w:sz w:val="23"/>
+          <w:sz-cs w:val="23"/>
+          <w:spacing w:val="0"/>
+          <w:color w:val="151312"/>
+        </w:rPr>
+        <w:t xml:space="preserve">id</w:t>
+      </w:r>
+      <w:r>
+        <w:rPr>
+          <w:rFonts w:ascii="Helvetica" w:hAnsi="Helvetica" w:cs="Helvetica"/>
+          <w:sz w:val="25"/>
+          <w:sz-cs w:val="25"/>
+          <w:spacing w:val="0"/>
+          <w:color w:val="151312"/>
+        </w:rPr>
+        <w:t xml:space="preserve"/>
+      </w:r>
+    </w:p>
+    <w:p>
+      <w:pPr/>
+      <w:r>
+        <w:rPr>
+          <w:rFonts w:ascii="Helvetica" w:hAnsi="Helvetica" w:cs="Helvetica"/>
+          <w:sz w:val="25"/>
+          <w:sz-cs w:val="25"/>
+          <w:spacing w:val="0"/>
+          <w:color w:val="151312"/>
+        </w:rPr>
+        <w:t xml:space="preserve">str36</w:t>
+      </w:r>
+    </w:p>
+    <w:p>
+      <w:pPr/>
+      <w:r>
+        <w:rPr>
+          <w:rFonts w:ascii="Helvetica" w:hAnsi="Helvetica" w:cs="Helvetica"/>
+          <w:sz w:val="25"/>
+          <w:sz-cs w:val="25"/>
+          <w:spacing w:val="0"/>
+          <w:color w:val="151312"/>
+        </w:rPr>
+        <w:t xml:space="preserve">no</w:t>
+      </w:r>
+    </w:p>
+    <w:p>
+      <w:pPr/>
+      <w:r>
+        <w:rPr>
+          <w:rFonts w:ascii="Helvetica" w:hAnsi="Helvetica" w:cs="Helvetica"/>
+          <w:sz w:val="25"/>
+          <w:sz-cs w:val="25"/>
+          <w:spacing w:val="0"/>
+          <w:color w:val="151312"/>
+        </w:rPr>
+        <w:t xml:space="preserve">PK</w:t>
+      </w:r>
+    </w:p>
+    <w:p>
+      <w:pPr/>
+      <w:r>
+        <w:rPr>
+          <w:rFonts w:ascii=".AppleSystemUIFontMonospaced" w:hAnsi=".AppleSystemUIFontMonospaced" w:cs=".AppleSystemUIFontMonospaced"/>
+          <w:sz w:val="23"/>
+          <w:sz-cs w:val="23"/>
+          <w:spacing w:val="0"/>
+          <w:color w:val="151312"/>
+        </w:rPr>
+        <w:t xml:space="preserve">underlying</w:t>
+      </w:r>
+      <w:r>
+        <w:rPr>
+          <w:rFonts w:ascii="Helvetica" w:hAnsi="Helvetica" w:cs="Helvetica"/>
+          <w:sz w:val="25"/>
+          <w:sz-cs w:val="25"/>
+          <w:spacing w:val="0"/>
+          <w:color w:val="151312"/>
+        </w:rPr>
+        <w:t xml:space="preserve"/>
+      </w:r>
+    </w:p>
+    <w:p>
+      <w:pPr/>
+      <w:r>
+        <w:rPr>
+          <w:rFonts w:ascii="Helvetica" w:hAnsi="Helvetica" w:cs="Helvetica"/>
+          <w:sz w:val="25"/>
+          <w:sz-cs w:val="25"/>
+          <w:spacing w:val="0"/>
+          <w:color w:val="151312"/>
+        </w:rPr>
+        <w:t xml:space="preserve">str32</w:t>
+      </w:r>
+    </w:p>
+    <w:p>
+      <w:pPr/>
+      <w:r>
+        <w:rPr>
+          <w:rFonts w:ascii="Helvetica" w:hAnsi="Helvetica" w:cs="Helvetica"/>
+          <w:sz w:val="25"/>
+          <w:sz-cs w:val="25"/>
+          <w:spacing w:val="0"/>
+          <w:color w:val="151312"/>
+        </w:rPr>
+        <w:t xml:space="preserve">no</w:t>
+      </w:r>
+    </w:p>
+    <w:p>
+      <w:pPr/>
+      <w:r>
+        <w:rPr>
+          <w:rFonts w:ascii="Helvetica" w:hAnsi="Helvetica" w:cs="Helvetica"/>
+          <w:sz w:val="25"/>
+          <w:sz-cs w:val="25"/>
+          <w:spacing w:val="0"/>
+          <w:color w:val="151312"/>
+        </w:rPr>
+        <w:t xml:space="preserve">Upper-cased symbol</w:t>
+      </w:r>
+    </w:p>
+    <w:p>
+      <w:pPr/>
+      <w:r>
+        <w:rPr>
+          <w:rFonts w:ascii=".AppleSystemUIFontMonospaced" w:hAnsi=".AppleSystemUIFontMonospaced" w:cs=".AppleSystemUIFontMonospaced"/>
+          <w:sz w:val="23"/>
+          <w:sz-cs w:val="23"/>
+          <w:spacing w:val="0"/>
+          <w:color w:val="151312"/>
+        </w:rPr>
+        <w:t xml:space="preserve">instrument</w:t>
+      </w:r>
+      <w:r>
+        <w:rPr>
+          <w:rFonts w:ascii="Helvetica" w:hAnsi="Helvetica" w:cs="Helvetica"/>
+          <w:sz w:val="25"/>
+          <w:sz-cs w:val="25"/>
+          <w:spacing w:val="0"/>
+          <w:color w:val="151312"/>
+        </w:rPr>
+        <w:t xml:space="preserve"/>
+      </w:r>
+    </w:p>
+    <w:p>
+      <w:pPr/>
+      <w:r>
+        <w:rPr>
+          <w:rFonts w:ascii="Helvetica" w:hAnsi="Helvetica" w:cs="Helvetica"/>
+          <w:sz w:val="25"/>
+          <w:sz-cs w:val="25"/>
+          <w:spacing w:val="0"/>
+          <w:color w:val="151312"/>
+        </w:rPr>
+        <w:t xml:space="preserve">str8</w:t>
+      </w:r>
+    </w:p>
+    <w:p>
+      <w:pPr/>
+      <w:r>
+        <w:rPr>
+          <w:rFonts w:ascii="Helvetica" w:hAnsi="Helvetica" w:cs="Helvetica"/>
+          <w:sz w:val="25"/>
+          <w:sz-cs w:val="25"/>
+          <w:spacing w:val="0"/>
+          <w:color w:val="151312"/>
+        </w:rPr>
+        <w:t xml:space="preserve">no</w:t>
+      </w:r>
+    </w:p>
+    <w:p>
+      <w:pPr/>
+      <w:r>
+        <w:rPr>
+          <w:rFonts w:ascii=".AppleSystemUIFontMonospaced" w:hAnsi=".AppleSystemUIFontMonospaced" w:cs=".AppleSystemUIFontMonospaced"/>
+          <w:sz w:val="23"/>
+          <w:sz-cs w:val="23"/>
+          <w:spacing w:val="0"/>
+          <w:color w:val="151312"/>
+        </w:rPr>
+        <w:t xml:space="preserve">EQ</w:t>
+      </w:r>
+      <w:r>
+        <w:rPr>
+          <w:rFonts w:ascii="Helvetica" w:hAnsi="Helvetica" w:cs="Helvetica"/>
+          <w:sz w:val="25"/>
+          <w:sz-cs w:val="25"/>
+          <w:spacing w:val="0"/>
+          <w:color w:val="151312"/>
+        </w:rPr>
+        <w:t xml:space="preserve">, </w:t>
+      </w:r>
+      <w:r>
+        <w:rPr>
+          <w:rFonts w:ascii=".AppleSystemUIFontMonospaced" w:hAnsi=".AppleSystemUIFontMonospaced" w:cs=".AppleSystemUIFontMonospaced"/>
+          <w:sz w:val="23"/>
+          <w:sz-cs w:val="23"/>
+          <w:spacing w:val="0"/>
+          <w:color w:val="151312"/>
+        </w:rPr>
+        <w:t xml:space="preserve">FUT</w:t>
+      </w:r>
+      <w:r>
+        <w:rPr>
+          <w:rFonts w:ascii="Helvetica" w:hAnsi="Helvetica" w:cs="Helvetica"/>
+          <w:sz w:val="25"/>
+          <w:sz-cs w:val="25"/>
+          <w:spacing w:val="0"/>
+          <w:color w:val="151312"/>
+        </w:rPr>
+        <w:t xml:space="preserve">, </w:t>
+      </w:r>
+      <w:r>
+        <w:rPr>
+          <w:rFonts w:ascii=".AppleSystemUIFontMonospaced" w:hAnsi=".AppleSystemUIFontMonospaced" w:cs=".AppleSystemUIFontMonospaced"/>
+          <w:sz w:val="23"/>
+          <w:sz-cs w:val="23"/>
+          <w:spacing w:val="0"/>
+          <w:color w:val="151312"/>
+        </w:rPr>
+        <w:t xml:space="preserve">CE</w:t>
+      </w:r>
+      <w:r>
+        <w:rPr>
+          <w:rFonts w:ascii="Helvetica" w:hAnsi="Helvetica" w:cs="Helvetica"/>
+          <w:sz w:val="25"/>
+          <w:sz-cs w:val="25"/>
+          <w:spacing w:val="0"/>
+          <w:color w:val="151312"/>
+        </w:rPr>
+        <w:t xml:space="preserve">, or </w:t>
+      </w:r>
+      <w:r>
+        <w:rPr>
+          <w:rFonts w:ascii=".AppleSystemUIFontMonospaced" w:hAnsi=".AppleSystemUIFontMonospaced" w:cs=".AppleSystemUIFontMonospaced"/>
+          <w:sz w:val="23"/>
+          <w:sz-cs w:val="23"/>
+          <w:spacing w:val="0"/>
+          <w:color w:val="151312"/>
+        </w:rPr>
+        <w:t xml:space="preserve">PE</w:t>
+      </w:r>
+      <w:r>
+        <w:rPr>
+          <w:rFonts w:ascii="Helvetica" w:hAnsi="Helvetica" w:cs="Helvetica"/>
+          <w:sz w:val="25"/>
+          <w:sz-cs w:val="25"/>
+          <w:spacing w:val="0"/>
+          <w:color w:val="151312"/>
+        </w:rPr>
+        <w:t xml:space="preserve"/>
+      </w:r>
+    </w:p>
+    <w:p>
+      <w:pPr/>
+      <w:r>
+        <w:rPr>
+          <w:rFonts w:ascii=".AppleSystemUIFontMonospaced" w:hAnsi=".AppleSystemUIFontMonospaced" w:cs=".AppleSystemUIFontMonospaced"/>
+          <w:sz w:val="23"/>
+          <w:sz-cs w:val="23"/>
+          <w:spacing w:val="0"/>
+          <w:color w:val="151312"/>
+        </w:rPr>
+        <w:t xml:space="preserve">strike</w:t>
+      </w:r>
+      <w:r>
+        <w:rPr>
+          <w:rFonts w:ascii="Helvetica" w:hAnsi="Helvetica" w:cs="Helvetica"/>
+          <w:sz w:val="25"/>
+          <w:sz-cs w:val="25"/>
+          <w:spacing w:val="0"/>
+          <w:color w:val="151312"/>
+        </w:rPr>
+        <w:t xml:space="preserve"/>
+      </w:r>
+    </w:p>
+    <w:p>
+      <w:pPr/>
+      <w:r>
+        <w:rPr>
+          <w:rFonts w:ascii="Helvetica" w:hAnsi="Helvetica" w:cs="Helvetica"/>
+          <w:sz w:val="25"/>
+          <w:sz-cs w:val="25"/>
+          <w:spacing w:val="0"/>
+          <w:color w:val="151312"/>
+        </w:rPr>
+        <w:t xml:space="preserve">float</w:t>
+      </w:r>
+    </w:p>
+    <w:p>
+      <w:pPr/>
+      <w:r>
+        <w:rPr>
+          <w:rFonts w:ascii="Helvetica" w:hAnsi="Helvetica" w:cs="Helvetica"/>
+          <w:sz w:val="25"/>
+          <w:sz-cs w:val="25"/>
+          <w:spacing w:val="0"/>
+          <w:color w:val="151312"/>
+        </w:rPr>
+        <w:t xml:space="preserve">yes</w:t>
+      </w:r>
+    </w:p>
+    <w:p>
+      <w:pPr/>
+      <w:r>
+        <w:rPr>
+          <w:rFonts w:ascii="Helvetica" w:hAnsi="Helvetica" w:cs="Helvetica"/>
+          <w:sz w:val="25"/>
+          <w:sz-cs w:val="25"/>
+          <w:spacing w:val="0"/>
+          <w:color w:val="151312"/>
+        </w:rPr>
+        <w:t xml:space="preserve">Options only</w:t>
+      </w:r>
+    </w:p>
+    <w:p>
+      <w:pPr/>
+      <w:r>
+        <w:rPr>
+          <w:rFonts w:ascii=".AppleSystemUIFontMonospaced" w:hAnsi=".AppleSystemUIFontMonospaced" w:cs=".AppleSystemUIFontMonospaced"/>
+          <w:sz w:val="23"/>
+          <w:sz-cs w:val="23"/>
+          <w:spacing w:val="0"/>
+          <w:color w:val="151312"/>
+        </w:rPr>
+        <w:t xml:space="preserve">expiry</w:t>
+      </w:r>
+      <w:r>
+        <w:rPr>
+          <w:rFonts w:ascii="Helvetica" w:hAnsi="Helvetica" w:cs="Helvetica"/>
+          <w:sz w:val="25"/>
+          <w:sz-cs w:val="25"/>
+          <w:spacing w:val="0"/>
+          <w:color w:val="151312"/>
+        </w:rPr>
+        <w:t xml:space="preserve"/>
+      </w:r>
+    </w:p>
+    <w:p>
+      <w:pPr/>
+      <w:r>
+        <w:rPr>
+          <w:rFonts w:ascii="Helvetica" w:hAnsi="Helvetica" w:cs="Helvetica"/>
+          <w:sz w:val="25"/>
+          <w:sz-cs w:val="25"/>
+          <w:spacing w:val="0"/>
+          <w:color w:val="151312"/>
+        </w:rPr>
+        <w:t xml:space="preserve">str10</w:t>
+      </w:r>
+    </w:p>
+    <w:p>
+      <w:pPr/>
+      <w:r>
+        <w:rPr>
+          <w:rFonts w:ascii="Helvetica" w:hAnsi="Helvetica" w:cs="Helvetica"/>
+          <w:sz w:val="25"/>
+          <w:sz-cs w:val="25"/>
+          <w:spacing w:val="0"/>
+          <w:color w:val="151312"/>
+        </w:rPr>
+        <w:t xml:space="preserve">yes</w:t>
+      </w:r>
+    </w:p>
+    <w:p>
+      <w:pPr/>
+      <w:r>
+        <w:rPr>
+          <w:rFonts w:ascii=".AppleSystemUIFontMonospaced" w:hAnsi=".AppleSystemUIFontMonospaced" w:cs=".AppleSystemUIFontMonospaced"/>
+          <w:sz w:val="23"/>
+          <w:sz-cs w:val="23"/>
+          <w:spacing w:val="0"/>
+          <w:color w:val="151312"/>
+        </w:rPr>
+        <w:t xml:space="preserve">YYYY-MM-DD</w:t>
+      </w:r>
+      <w:r>
+        <w:rPr>
+          <w:rFonts w:ascii="Helvetica" w:hAnsi="Helvetica" w:cs="Helvetica"/>
+          <w:sz w:val="25"/>
+          <w:sz-cs w:val="25"/>
+          <w:spacing w:val="0"/>
+          <w:color w:val="151312"/>
+        </w:rPr>
+        <w:t xml:space="preserve"/>
+      </w:r>
+    </w:p>
+    <w:p>
+      <w:pPr/>
+      <w:r>
+        <w:rPr>
+          <w:rFonts w:ascii=".AppleSystemUIFontMonospaced" w:hAnsi=".AppleSystemUIFontMonospaced" w:cs=".AppleSystemUIFontMonospaced"/>
+          <w:sz w:val="23"/>
+          <w:sz-cs w:val="23"/>
+          <w:spacing w:val="0"/>
+          <w:color w:val="151312"/>
+        </w:rPr>
+        <w:t xml:space="preserve">side</w:t>
+      </w:r>
+      <w:r>
+        <w:rPr>
+          <w:rFonts w:ascii="Helvetica" w:hAnsi="Helvetica" w:cs="Helvetica"/>
+          <w:sz w:val="25"/>
+          <w:sz-cs w:val="25"/>
+          <w:spacing w:val="0"/>
+          <w:color w:val="151312"/>
+        </w:rPr>
+        <w:t xml:space="preserve"/>
+      </w:r>
+    </w:p>
+    <w:p>
+      <w:pPr/>
+      <w:r>
+        <w:rPr>
+          <w:rFonts w:ascii="Helvetica" w:hAnsi="Helvetica" w:cs="Helvetica"/>
+          <w:sz w:val="25"/>
+          <w:sz-cs w:val="25"/>
+          <w:spacing w:val="0"/>
+          <w:color w:val="151312"/>
+        </w:rPr>
+        <w:t xml:space="preserve">str4</w:t>
+      </w:r>
+    </w:p>
+    <w:p>
+      <w:pPr/>
+      <w:r>
+        <w:rPr>
+          <w:rFonts w:ascii="Helvetica" w:hAnsi="Helvetica" w:cs="Helvetica"/>
+          <w:sz w:val="25"/>
+          <w:sz-cs w:val="25"/>
+          <w:spacing w:val="0"/>
+          <w:color w:val="151312"/>
+        </w:rPr>
+        <w:t xml:space="preserve">no</w:t>
+      </w:r>
+    </w:p>
+    <w:p>
+      <w:pPr/>
+      <w:r>
+        <w:rPr>
+          <w:rFonts w:ascii=".AppleSystemUIFontMonospaced" w:hAnsi=".AppleSystemUIFontMonospaced" w:cs=".AppleSystemUIFontMonospaced"/>
+          <w:sz w:val="23"/>
+          <w:sz-cs w:val="23"/>
+          <w:spacing w:val="0"/>
+          <w:color w:val="151312"/>
+        </w:rPr>
+        <w:t xml:space="preserve">BUY</w:t>
+      </w:r>
+      <w:r>
+        <w:rPr>
+          <w:rFonts w:ascii="Helvetica" w:hAnsi="Helvetica" w:cs="Helvetica"/>
+          <w:sz w:val="25"/>
+          <w:sz-cs w:val="25"/>
+          <w:spacing w:val="0"/>
+          <w:color w:val="151312"/>
+        </w:rPr>
+        <w:t xml:space="preserve"> or </w:t>
+      </w:r>
+      <w:r>
+        <w:rPr>
+          <w:rFonts w:ascii=".AppleSystemUIFontMonospaced" w:hAnsi=".AppleSystemUIFontMonospaced" w:cs=".AppleSystemUIFontMonospaced"/>
+          <w:sz w:val="23"/>
+          <w:sz-cs w:val="23"/>
+          <w:spacing w:val="0"/>
+          <w:color w:val="151312"/>
+        </w:rPr>
+        <w:t xml:space="preserve">SELL</w:t>
+      </w:r>
+      <w:r>
+        <w:rPr>
+          <w:rFonts w:ascii="Helvetica" w:hAnsi="Helvetica" w:cs="Helvetica"/>
+          <w:sz w:val="25"/>
+          <w:sz-cs w:val="25"/>
+          <w:spacing w:val="0"/>
+          <w:color w:val="151312"/>
+        </w:rPr>
+        <w:t xml:space="preserve"/>
+      </w:r>
+    </w:p>
+    <w:p>
+      <w:pPr/>
+      <w:r>
+        <w:rPr>
+          <w:rFonts w:ascii=".AppleSystemUIFontMonospaced" w:hAnsi=".AppleSystemUIFontMonospaced" w:cs=".AppleSystemUIFontMonospaced"/>
+          <w:sz w:val="23"/>
+          <w:sz-cs w:val="23"/>
+          <w:spacing w:val="0"/>
+          <w:color w:val="151312"/>
+        </w:rPr>
+        <w:t xml:space="preserve">lots</w:t>
+      </w:r>
+      <w:r>
+        <w:rPr>
+          <w:rFonts w:ascii="Helvetica" w:hAnsi="Helvetica" w:cs="Helvetica"/>
+          <w:sz w:val="25"/>
+          <w:sz-cs w:val="25"/>
+          <w:spacing w:val="0"/>
+          <w:color w:val="151312"/>
+        </w:rPr>
+        <w:t xml:space="preserve"/>
+      </w:r>
+    </w:p>
+    <w:p>
+      <w:pPr/>
+      <w:r>
+        <w:rPr>
+          <w:rFonts w:ascii="Helvetica" w:hAnsi="Helvetica" w:cs="Helvetica"/>
+          <w:sz w:val="25"/>
+          <w:sz-cs w:val="25"/>
+          <w:spacing w:val="0"/>
+          <w:color w:val="151312"/>
+        </w:rPr>
+        <w:t xml:space="preserve">int</w:t>
+      </w:r>
+    </w:p>
+    <w:p>
+      <w:pPr/>
+      <w:r>
+        <w:rPr>
+          <w:rFonts w:ascii="Helvetica" w:hAnsi="Helvetica" w:cs="Helvetica"/>
+          <w:sz w:val="25"/>
+          <w:sz-cs w:val="25"/>
+          <w:spacing w:val="0"/>
+          <w:color w:val="151312"/>
+        </w:rPr>
+        <w:t xml:space="preserve">no</w:t>
+      </w:r>
+    </w:p>
+    <w:p>
+      <w:pPr/>
+      <w:r>
+        <w:rPr>
+          <w:rFonts w:ascii="Helvetica" w:hAnsi="Helvetica" w:cs="Helvetica"/>
+          <w:sz w:val="25"/>
+          <w:sz-cs w:val="25"/>
+          <w:spacing w:val="0"/>
+          <w:color w:val="151312"/>
+        </w:rPr>
+        <w:t xml:space="preserve">Shares for </w:t>
+      </w:r>
+      <w:r>
+        <w:rPr>
+          <w:rFonts w:ascii=".AppleSystemUIFontMonospaced" w:hAnsi=".AppleSystemUIFontMonospaced" w:cs=".AppleSystemUIFontMonospaced"/>
+          <w:sz w:val="23"/>
+          <w:sz-cs w:val="23"/>
+          <w:spacing w:val="0"/>
+          <w:color w:val="151312"/>
+        </w:rPr>
+        <w:t xml:space="preserve">EQ</w:t>
+      </w:r>
+      <w:r>
+        <w:rPr>
+          <w:rFonts w:ascii="Helvetica" w:hAnsi="Helvetica" w:cs="Helvetica"/>
+          <w:sz w:val="25"/>
+          <w:sz-cs w:val="25"/>
+          <w:spacing w:val="0"/>
+          <w:color w:val="151312"/>
+        </w:rPr>
+        <w:t xml:space="preserve"/>
+      </w:r>
+    </w:p>
+    <w:p>
+      <w:pPr/>
+      <w:r>
+        <w:rPr>
+          <w:rFonts w:ascii=".AppleSystemUIFontMonospaced" w:hAnsi=".AppleSystemUIFontMonospaced" w:cs=".AppleSystemUIFontMonospaced"/>
+          <w:sz w:val="23"/>
+          <w:sz-cs w:val="23"/>
+          <w:spacing w:val="0"/>
+          <w:color w:val="151312"/>
+        </w:rPr>
+        <w:t xml:space="preserve">lot_size</w:t>
+      </w:r>
+      <w:r>
+        <w:rPr>
+          <w:rFonts w:ascii="Helvetica" w:hAnsi="Helvetica" w:cs="Helvetica"/>
+          <w:sz w:val="25"/>
+          <w:sz-cs w:val="25"/>
+          <w:spacing w:val="0"/>
+          <w:color w:val="151312"/>
+        </w:rPr>
+        <w:t xml:space="preserve"/>
+      </w:r>
+    </w:p>
+    <w:p>
+      <w:pPr/>
+      <w:r>
+        <w:rPr>
+          <w:rFonts w:ascii="Helvetica" w:hAnsi="Helvetica" w:cs="Helvetica"/>
+          <w:sz w:val="25"/>
+          <w:sz-cs w:val="25"/>
+          <w:spacing w:val="0"/>
+          <w:color w:val="151312"/>
+        </w:rPr>
+        <w:t xml:space="preserve">int</w:t>
+      </w:r>
+    </w:p>
+    <w:p>
+      <w:pPr/>
+      <w:r>
+        <w:rPr>
+          <w:rFonts w:ascii="Helvetica" w:hAnsi="Helvetica" w:cs="Helvetica"/>
+          <w:sz w:val="25"/>
+          <w:sz-cs w:val="25"/>
+          <w:spacing w:val="0"/>
+          <w:color w:val="151312"/>
+        </w:rPr>
+        <w:t xml:space="preserve">no</w:t>
+      </w:r>
+    </w:p>
+    <w:p>
+      <w:pPr/>
+      <w:r>
+        <w:rPr>
+          <w:rFonts w:ascii="Helvetica" w:hAnsi="Helvetica" w:cs="Helvetica"/>
+          <w:sz w:val="25"/>
+          <w:sz-cs w:val="25"/>
+          <w:spacing w:val="0"/>
+          <w:color w:val="151312"/>
+        </w:rPr>
+        <w:t xml:space="preserve">1 for </w:t>
+      </w:r>
+      <w:r>
+        <w:rPr>
+          <w:rFonts w:ascii=".AppleSystemUIFontMonospaced" w:hAnsi=".AppleSystemUIFontMonospaced" w:cs=".AppleSystemUIFontMonospaced"/>
+          <w:sz w:val="23"/>
+          <w:sz-cs w:val="23"/>
+          <w:spacing w:val="0"/>
+          <w:color w:val="151312"/>
+        </w:rPr>
+        <w:t xml:space="preserve">EQ</w:t>
+      </w:r>
+      <w:r>
+        <w:rPr>
+          <w:rFonts w:ascii="Helvetica" w:hAnsi="Helvetica" w:cs="Helvetica"/>
+          <w:sz w:val="25"/>
+          <w:sz-cs w:val="25"/>
+          <w:spacing w:val="0"/>
+          <w:color w:val="151312"/>
+        </w:rPr>
+        <w:t xml:space="preserve">, else from </w:t>
+      </w:r>
+      <w:r>
+        <w:rPr>
+          <w:rFonts w:ascii=".AppleSystemUIFontMonospaced" w:hAnsi=".AppleSystemUIFontMonospaced" w:cs=".AppleSystemUIFontMonospaced"/>
+          <w:sz w:val="23"/>
+          <w:sz-cs w:val="23"/>
+          <w:spacing w:val="0"/>
+          <w:color w:val="151312"/>
+        </w:rPr>
+        <w:t xml:space="preserve">LOT_SIZES</w:t>
+      </w:r>
+      <w:r>
+        <w:rPr>
+          <w:rFonts w:ascii="Helvetica" w:hAnsi="Helvetica" w:cs="Helvetica"/>
+          <w:sz w:val="25"/>
+          <w:sz-cs w:val="25"/>
+          <w:spacing w:val="0"/>
+          <w:color w:val="151312"/>
+        </w:rPr>
+        <w:t xml:space="preserve"/>
+      </w:r>
+    </w:p>
+    <w:p>
+      <w:pPr/>
+      <w:r>
+        <w:rPr>
+          <w:rFonts w:ascii=".AppleSystemUIFontMonospaced" w:hAnsi=".AppleSystemUIFontMonospaced" w:cs=".AppleSystemUIFontMonospaced"/>
+          <w:sz w:val="23"/>
+          <w:sz-cs w:val="23"/>
+          <w:spacing w:val="0"/>
+          <w:color w:val="151312"/>
+        </w:rPr>
+        <w:t xml:space="preserve">price</w:t>
+      </w:r>
+      <w:r>
+        <w:rPr>
+          <w:rFonts w:ascii="Helvetica" w:hAnsi="Helvetica" w:cs="Helvetica"/>
+          <w:sz w:val="25"/>
+          <w:sz-cs w:val="25"/>
+          <w:spacing w:val="0"/>
+          <w:color w:val="151312"/>
+        </w:rPr>
+        <w:t xml:space="preserve"/>
+      </w:r>
+    </w:p>
+    <w:p>
+      <w:pPr/>
+      <w:r>
+        <w:rPr>
+          <w:rFonts w:ascii="Helvetica" w:hAnsi="Helvetica" w:cs="Helvetica"/>
+          <w:sz w:val="25"/>
+          <w:sz-cs w:val="25"/>
+          <w:spacing w:val="0"/>
+          <w:color w:val="151312"/>
+        </w:rPr>
+        <w:t xml:space="preserve">float</w:t>
+      </w:r>
+    </w:p>
+    <w:p>
+      <w:pPr/>
+      <w:r>
+        <w:rPr>
+          <w:rFonts w:ascii="Helvetica" w:hAnsi="Helvetica" w:cs="Helvetica"/>
+          <w:sz w:val="25"/>
+          <w:sz-cs w:val="25"/>
+          <w:spacing w:val="0"/>
+          <w:color w:val="151312"/>
+        </w:rPr>
+        <w:t xml:space="preserve">no</w:t>
+      </w:r>
+    </w:p>
+    <w:p>
+      <w:pPr/>
+      <w:r>
+        <w:rPr>
+          <w:rFonts w:ascii="Helvetica" w:hAnsi="Helvetica" w:cs="Helvetica"/>
+          <w:sz w:val="25"/>
+          <w:sz-cs w:val="25"/>
+          <w:spacing w:val="0"/>
+          <w:color w:val="151312"/>
+        </w:rPr>
+        <w:t xml:space="preserve">Price the user typed</w:t>
+      </w:r>
+    </w:p>
+    <w:p>
+      <w:pPr/>
+      <w:r>
+        <w:rPr>
+          <w:rFonts w:ascii=".AppleSystemUIFontMonospaced" w:hAnsi=".AppleSystemUIFontMonospaced" w:cs=".AppleSystemUIFontMonospaced"/>
+          <w:sz w:val="23"/>
+          <w:sz-cs w:val="23"/>
+          <w:spacing w:val="0"/>
+          <w:color w:val="151312"/>
+        </w:rPr>
+        <w:t xml:space="preserve">charges</w:t>
+      </w:r>
+      <w:r>
+        <w:rPr>
+          <w:rFonts w:ascii="Helvetica" w:hAnsi="Helvetica" w:cs="Helvetica"/>
+          <w:sz w:val="25"/>
+          <w:sz-cs w:val="25"/>
+          <w:spacing w:val="0"/>
+          <w:color w:val="151312"/>
+        </w:rPr>
+        <w:t xml:space="preserve"/>
+      </w:r>
+    </w:p>
+    <w:p>
+      <w:pPr/>
+      <w:r>
+        <w:rPr>
+          <w:rFonts w:ascii="Helvetica" w:hAnsi="Helvetica" w:cs="Helvetica"/>
+          <w:sz w:val="25"/>
+          <w:sz-cs w:val="25"/>
+          <w:spacing w:val="0"/>
+          <w:color w:val="151312"/>
+        </w:rPr>
+        <w:t xml:space="preserve">json</w:t>
+      </w:r>
+    </w:p>
+    <w:p>
+      <w:pPr/>
+      <w:r>
+        <w:rPr>
+          <w:rFonts w:ascii="Helvetica" w:hAnsi="Helvetica" w:cs="Helvetica"/>
+          <w:sz w:val="25"/>
+          <w:sz-cs w:val="25"/>
+          <w:spacing w:val="0"/>
+          <w:color w:val="151312"/>
+        </w:rPr>
+        <w:t xml:space="preserve">no</w:t>
+      </w:r>
+    </w:p>
+    <w:p>
+      <w:pPr/>
+      <w:r>
+        <w:rPr>
+          <w:rFonts w:ascii="Helvetica" w:hAnsi="Helvetica" w:cs="Helvetica"/>
+          <w:sz w:val="25"/>
+          <w:sz-cs w:val="25"/>
+          <w:spacing w:val="0"/>
+          <w:color w:val="151312"/>
+        </w:rPr>
+        <w:t xml:space="preserve">Cost breakdown plus </w:t>
+      </w:r>
+      <w:r>
+        <w:rPr>
+          <w:rFonts w:ascii=".AppleSystemUIFontMonospaced" w:hAnsi=".AppleSystemUIFontMonospaced" w:cs=".AppleSystemUIFontMonospaced"/>
+          <w:sz w:val="23"/>
+          <w:sz-cs w:val="23"/>
+          <w:spacing w:val="0"/>
+          <w:color w:val="151312"/>
+        </w:rPr>
+        <w:t xml:space="preserve">total</w:t>
+      </w:r>
+      <w:r>
+        <w:rPr>
+          <w:rFonts w:ascii="Helvetica" w:hAnsi="Helvetica" w:cs="Helvetica"/>
+          <w:sz w:val="25"/>
+          <w:sz-cs w:val="25"/>
+          <w:spacing w:val="0"/>
+          <w:color w:val="151312"/>
+        </w:rPr>
+        <w:t xml:space="preserve"/>
+      </w:r>
+    </w:p>
+    <w:p>
+      <w:pPr/>
+      <w:r>
+        <w:rPr>
+          <w:rFonts w:ascii=".AppleSystemUIFontMonospaced" w:hAnsi=".AppleSystemUIFontMonospaced" w:cs=".AppleSystemUIFontMonospaced"/>
+          <w:sz w:val="23"/>
+          <w:sz-cs w:val="23"/>
+          <w:spacing w:val="0"/>
+          <w:color w:val="151312"/>
+        </w:rPr>
+        <w:t xml:space="preserve">strategy_id</w:t>
+      </w:r>
+      <w:r>
+        <w:rPr>
+          <w:rFonts w:ascii="Helvetica" w:hAnsi="Helvetica" w:cs="Helvetica"/>
+          <w:sz w:val="25"/>
+          <w:sz-cs w:val="25"/>
+          <w:spacing w:val="0"/>
+          <w:color w:val="151312"/>
+        </w:rPr>
+        <w:t xml:space="preserve"/>
+      </w:r>
+    </w:p>
+    <w:p>
+      <w:pPr/>
+      <w:r>
+        <w:rPr>
+          <w:rFonts w:ascii="Helvetica" w:hAnsi="Helvetica" w:cs="Helvetica"/>
+          <w:sz w:val="25"/>
+          <w:sz-cs w:val="25"/>
+          <w:spacing w:val="0"/>
+          <w:color w:val="151312"/>
+        </w:rPr>
+        <w:t xml:space="preserve">str36</w:t>
+      </w:r>
+    </w:p>
+    <w:p>
+      <w:pPr/>
+      <w:r>
+        <w:rPr>
+          <w:rFonts w:ascii="Helvetica" w:hAnsi="Helvetica" w:cs="Helvetica"/>
+          <w:sz w:val="25"/>
+          <w:sz-cs w:val="25"/>
+          <w:spacing w:val="0"/>
+          <w:color w:val="151312"/>
+        </w:rPr>
+        <w:t xml:space="preserve">yes</w:t>
+      </w:r>
+    </w:p>
+    <w:p>
+      <w:pPr/>
+      <w:r>
+        <w:rPr>
+          <w:rFonts w:ascii="Helvetica" w:hAnsi="Helvetica" w:cs="Helvetica"/>
+          <w:sz w:val="25"/>
+          <w:sz-cs w:val="25"/>
+          <w:spacing w:val="0"/>
+          <w:color w:val="151312"/>
+        </w:rPr>
+        <w:t xml:space="preserve">FK </w:t>
+      </w:r>
+      <w:r>
+        <w:rPr>
+          <w:rFonts w:ascii=".AppleSystemUIFontMonospaced" w:hAnsi=".AppleSystemUIFontMonospaced" w:cs=".AppleSystemUIFontMonospaced"/>
+          <w:sz w:val="23"/>
+          <w:sz-cs w:val="23"/>
+          <w:spacing w:val="0"/>
+          <w:color w:val="151312"/>
+        </w:rPr>
+        <w:t xml:space="preserve">strategies.id</w:t>
+      </w:r>
+      <w:r>
+        <w:rPr>
+          <w:rFonts w:ascii="Helvetica" w:hAnsi="Helvetica" w:cs="Helvetica"/>
+          <w:sz w:val="25"/>
+          <w:sz-cs w:val="25"/>
+          <w:spacing w:val="0"/>
+          <w:color w:val="151312"/>
+        </w:rPr>
+        <w:t xml:space="preserve"/>
+      </w:r>
+    </w:p>
+    <w:p>
+      <w:pPr/>
+      <w:r>
+        <w:rPr>
+          <w:rFonts w:ascii=".AppleSystemUIFontMonospaced" w:hAnsi=".AppleSystemUIFontMonospaced" w:cs=".AppleSystemUIFontMonospaced"/>
+          <w:sz w:val="23"/>
+          <w:sz-cs w:val="23"/>
+          <w:spacing w:val="0"/>
+          <w:color w:val="151312"/>
+        </w:rPr>
+        <w:t xml:space="preserve">note</w:t>
+      </w:r>
+      <w:r>
+        <w:rPr>
+          <w:rFonts w:ascii="Helvetica" w:hAnsi="Helvetica" w:cs="Helvetica"/>
+          <w:sz w:val="25"/>
+          <w:sz-cs w:val="25"/>
+          <w:spacing w:val="0"/>
+          <w:color w:val="151312"/>
+        </w:rPr>
+        <w:t xml:space="preserve"/>
+      </w:r>
+    </w:p>
+    <w:p>
+      <w:pPr/>
+      <w:r>
+        <w:rPr>
+          <w:rFonts w:ascii="Helvetica" w:hAnsi="Helvetica" w:cs="Helvetica"/>
+          <w:sz w:val="25"/>
+          <w:sz-cs w:val="25"/>
+          <w:spacing w:val="0"/>
+          <w:color w:val="151312"/>
+        </w:rPr>
+        <w:t xml:space="preserve">text</w:t>
+      </w:r>
+    </w:p>
+    <w:p>
+      <w:pPr/>
+      <w:r>
+        <w:rPr>
+          <w:rFonts w:ascii="Helvetica" w:hAnsi="Helvetica" w:cs="Helvetica"/>
+          <w:sz w:val="25"/>
+          <w:sz-cs w:val="25"/>
+          <w:spacing w:val="0"/>
+          <w:color w:val="151312"/>
+        </w:rPr>
+        <w:t xml:space="preserve">yes</w:t>
+      </w:r>
+    </w:p>
+    <w:p>
+      <w:pPr/>
+      <w:r>
+        <w:rPr>
+          <w:rFonts w:ascii="Helvetica" w:hAnsi="Helvetica" w:cs="Helvetica"/>
+          <w:sz w:val="25"/>
+          <w:sz-cs w:val="25"/>
+          <w:spacing w:val="0"/>
+          <w:color w:val="151312"/>
+        </w:rPr>
+        <w:t xml:space="preserve"/>
+      </w:r>
+    </w:p>
+    <w:p>
+      <w:pPr/>
+      <w:r>
+        <w:rPr>
+          <w:rFonts w:ascii=".AppleSystemUIFontMonospaced" w:hAnsi=".AppleSystemUIFontMonospaced" w:cs=".AppleSystemUIFontMonospaced"/>
+          <w:sz w:val="23"/>
+          <w:sz-cs w:val="23"/>
+          <w:spacing w:val="0"/>
+          <w:color w:val="151312"/>
+        </w:rPr>
+        <w:t xml:space="preserve">actor</w:t>
+      </w:r>
+      <w:r>
+        <w:rPr>
+          <w:rFonts w:ascii="Helvetica" w:hAnsi="Helvetica" w:cs="Helvetica"/>
+          <w:sz w:val="25"/>
+          <w:sz-cs w:val="25"/>
+          <w:spacing w:val="0"/>
+          <w:color w:val="151312"/>
+        </w:rPr>
+        <w:t xml:space="preserve"/>
+      </w:r>
+    </w:p>
+    <w:p>
+      <w:pPr/>
+      <w:r>
+        <w:rPr>
+          <w:rFonts w:ascii="Helvetica" w:hAnsi="Helvetica" w:cs="Helvetica"/>
+          <w:sz w:val="25"/>
+          <w:sz-cs w:val="25"/>
+          <w:spacing w:val="0"/>
+          <w:color w:val="151312"/>
+        </w:rPr>
+        <w:t xml:space="preserve">str128</w:t>
+      </w:r>
+    </w:p>
+    <w:p>
+      <w:pPr/>
+      <w:r>
+        <w:rPr>
+          <w:rFonts w:ascii="Helvetica" w:hAnsi="Helvetica" w:cs="Helvetica"/>
+          <w:sz w:val="25"/>
+          <w:sz-cs w:val="25"/>
+          <w:spacing w:val="0"/>
+          <w:color w:val="151312"/>
+        </w:rPr>
+        <w:t xml:space="preserve">no</w:t>
+      </w:r>
+    </w:p>
+    <w:p>
+      <w:pPr/>
+      <w:r>
+        <w:rPr>
+          <w:rFonts w:ascii="Helvetica" w:hAnsi="Helvetica" w:cs="Helvetica"/>
+          <w:sz w:val="25"/>
+          <w:sz-cs w:val="25"/>
+          <w:spacing w:val="0"/>
+          <w:color w:val="151312"/>
+        </w:rPr>
+        <w:t xml:space="preserve"/>
+      </w:r>
+    </w:p>
+    <w:p>
+      <w:pPr/>
+      <w:r>
+        <w:rPr>
+          <w:rFonts w:ascii=".AppleSystemUIFontMonospaced" w:hAnsi=".AppleSystemUIFontMonospaced" w:cs=".AppleSystemUIFontMonospaced"/>
+          <w:sz w:val="23"/>
+          <w:sz-cs w:val="23"/>
+          <w:spacing w:val="0"/>
+          <w:color w:val="151312"/>
+        </w:rPr>
+        <w:t xml:space="preserve">created_at</w:t>
+      </w:r>
+      <w:r>
+        <w:rPr>
+          <w:rFonts w:ascii="Helvetica" w:hAnsi="Helvetica" w:cs="Helvetica"/>
+          <w:sz w:val="25"/>
+          <w:sz-cs w:val="25"/>
+          <w:spacing w:val="0"/>
+          <w:color w:val="151312"/>
+        </w:rPr>
+        <w:t xml:space="preserve"/>
+      </w:r>
+    </w:p>
+    <w:p>
+      <w:pPr/>
+      <w:r>
+        <w:rPr>
+          <w:rFonts w:ascii="Helvetica" w:hAnsi="Helvetica" w:cs="Helvetica"/>
+          <w:sz w:val="25"/>
+          <w:sz-cs w:val="25"/>
+          <w:spacing w:val="0"/>
+          <w:color w:val="151312"/>
+        </w:rPr>
+        <w:t xml:space="preserve">ts</w:t>
+      </w:r>
+    </w:p>
+    <w:p>
+      <w:pPr/>
+      <w:r>
+        <w:rPr>
+          <w:rFonts w:ascii="Helvetica" w:hAnsi="Helvetica" w:cs="Helvetica"/>
+          <w:sz w:val="25"/>
+          <w:sz-cs w:val="25"/>
+          <w:spacing w:val="0"/>
+          <w:color w:val="151312"/>
+        </w:rPr>
+        <w:t xml:space="preserve">no</w:t>
+      </w:r>
+    </w:p>
+    <w:p>
+      <w:pPr/>
+      <w:r>
+        <w:rPr>
+          <w:rFonts w:ascii="Helvetica" w:hAnsi="Helvetica" w:cs="Helvetica"/>
+          <w:sz w:val="25"/>
+          <w:sz-cs w:val="25"/>
+          <w:spacing w:val="0"/>
+          <w:color w:val="151312"/>
+        </w:rPr>
+        <w:t xml:space="preserve"/>
+      </w:r>
+    </w:p>
+    <w:p>
+      <w:pPr>
+        <w:spacing w:after="280"/>
+      </w:pPr>
       <w:r>
         <w:rPr>
           <w:rFonts w:ascii="Helvetica Neue" w:hAnsi="Helvetica Neue" w:cs="Helvetica Neue"/>
@@ -16803,7 +18105,7 @@
           <w:spacing w:val="0"/>
           <w:color w:val="151312"/>
         </w:rPr>
-        <w:t xml:space="preserve">live_audit_events</w:t>
+        <w:t xml:space="preserve">audit_events</w:t>
       </w:r>
       <w:r>
         <w:rPr>
@@ -16814,6 +18116,27 @@
           <w:spacing w:val="0"/>
           <w:color w:val="151312"/>
         </w:rPr>
+        <w:t xml:space="preserve"> and </w:t>
+      </w:r>
+      <w:r>
+        <w:rPr>
+          <w:rFonts w:ascii="Helvetica Neue" w:hAnsi="Helvetica Neue" w:cs="Helvetica Neue"/>
+          <w:sz w:val="23"/>
+          <w:sz-cs w:val="23"/>
+          <w:spacing w:val="0"/>
+          <w:color w:val="151312"/>
+        </w:rPr>
+        <w:t xml:space="preserve">live_audit_events</w:t>
+      </w:r>
+      <w:r>
+        <w:rPr>
+          <w:rFonts w:ascii="Helvetica" w:hAnsi="Helvetica" w:cs="Helvetica"/>
+          <w:sz w:val="28"/>
+          <w:sz-cs w:val="28"/>
+          <w:b/>
+          <w:spacing w:val="0"/>
+          <w:color w:val="151312"/>
+        </w:rPr>
         <w:t xml:space="preserve"/>
       </w:r>
     </w:p>
@@ -34576,6 +35899,64 @@
     </w:p>
     <w:p>
       <w:pPr>
+        <w:ind w:left="720" w:first-line="-720"/>
+      </w:pPr>
+      <w:r>
+        <w:rPr>
+          <w:rFonts w:ascii=".AppleSystemUIFontMonospaced" w:hAnsi=".AppleSystemUIFontMonospaced" w:cs=".AppleSystemUIFontMonospaced"/>
+          <w:sz w:val="23"/>
+          <w:sz-cs w:val="23"/>
+          <w:color w:val="151312"/>
+        </w:rPr>
+        <w:t xml:space="preserve"/>
+        <w:tab/>
+        <w:t xml:space="preserve">•</w:t>
+        <w:tab/>
+        <w:t xml:space="preserve"/>
+      </w:r>
+      <w:r>
+        <w:rPr>
+          <w:rFonts w:ascii=".AppleSystemUIFontMonospaced" w:hAnsi=".AppleSystemUIFontMonospaced" w:cs=".AppleSystemUIFontMonospaced"/>
+          <w:sz w:val="23"/>
+          <w:sz-cs w:val="23"/>
+          <w:spacing w:val="0"/>
+          <w:color w:val="151312"/>
+        </w:rPr>
+        <w:t xml:space="preserve">paper_orders.strategy_id</w:t>
+      </w:r>
+      <w:r>
+        <w:rPr>
+          <w:rFonts w:ascii="Helvetica" w:hAnsi="Helvetica" w:cs="Helvetica"/>
+          <w:sz w:val="25"/>
+          <w:sz-cs w:val="25"/>
+          <w:spacing w:val="0"/>
+          <w:color w:val="151312"/>
+        </w:rPr>
+        <w:t xml:space="preserve"> → </w:t>
+      </w:r>
+      <w:r>
+        <w:rPr>
+          <w:rFonts w:ascii=".AppleSystemUIFontMonospaced" w:hAnsi=".AppleSystemUIFontMonospaced" w:cs=".AppleSystemUIFontMonospaced"/>
+          <w:sz w:val="23"/>
+          <w:sz-cs w:val="23"/>
+          <w:spacing w:val="0"/>
+          <w:color w:val="151312"/>
+        </w:rPr>
+        <w:t xml:space="preserve">strategies</w:t>
+      </w:r>
+      <w:r>
+        <w:rPr>
+          <w:rFonts w:ascii="Helvetica" w:hAnsi="Helvetica" w:cs="Helvetica"/>
+          <w:sz w:val="25"/>
+          <w:sz-cs w:val="25"/>
+          <w:spacing w:val="0"/>
+          <w:color w:val="151312"/>
+        </w:rPr>
+        <w:t xml:space="preserve"/>
+      </w:r>
+    </w:p>
+    <w:p>
+      <w:pPr>
         <w:spacing w:after="250"/>
       </w:pPr>
       <w:r>
@@ -37096,6 +38477,98 @@
           <w:spacing w:val="0"/>
           <w:color w:val="151312"/>
         </w:rPr>
+        <w:t xml:space="preserve">Manual paper orders</w:t>
+      </w:r>
+    </w:p>
+    <w:p>
+      <w:pPr/>
+      <w:r>
+        <w:rPr>
+          <w:rFonts w:ascii="Helvetica" w:hAnsi="Helvetica" w:cs="Helvetica"/>
+          <w:sz w:val="25"/>
+          <w:sz-cs w:val="25"/>
+          <w:spacing w:val="0"/>
+          <w:color w:val="151312"/>
+        </w:rPr>
+        <w:t xml:space="preserve">Research (</w:t>
+      </w:r>
+      <w:r>
+        <w:rPr>
+          <w:rFonts w:ascii=".AppleSystemUIFontMonospaced" w:hAnsi=".AppleSystemUIFontMonospaced" w:cs=".AppleSystemUIFontMonospaced"/>
+          <w:sz w:val="23"/>
+          <w:sz-cs w:val="23"/>
+          <w:spacing w:val="0"/>
+          <w:color w:val="151312"/>
+        </w:rPr>
+        <w:t xml:space="preserve">paper_orders</w:t>
+      </w:r>
+      <w:r>
+        <w:rPr>
+          <w:rFonts w:ascii="Helvetica" w:hAnsi="Helvetica" w:cs="Helvetica"/>
+          <w:sz w:val="25"/>
+          <w:sz-cs w:val="25"/>
+          <w:spacing w:val="0"/>
+          <w:color w:val="151312"/>
+        </w:rPr>
+        <w:t xml:space="preserve">). Not the live </w:t>
+      </w:r>
+      <w:r>
+        <w:rPr>
+          <w:rFonts w:ascii=".AppleSystemUIFontMonospaced" w:hAnsi=".AppleSystemUIFontMonospaced" w:cs=".AppleSystemUIFontMonospaced"/>
+          <w:sz w:val="23"/>
+          <w:sz-cs w:val="23"/>
+          <w:spacing w:val="0"/>
+          <w:color w:val="151312"/>
+        </w:rPr>
+        <w:t xml:space="preserve">orders</w:t>
+      </w:r>
+      <w:r>
+        <w:rPr>
+          <w:rFonts w:ascii="Helvetica" w:hAnsi="Helvetica" w:cs="Helvetica"/>
+          <w:sz w:val="25"/>
+          <w:sz-cs w:val="25"/>
+          <w:spacing w:val="0"/>
+          <w:color w:val="151312"/>
+        </w:rPr>
+        <w:t xml:space="preserve"> table</w:t>
+      </w:r>
+    </w:p>
+    <w:p>
+      <w:pPr/>
+      <w:r>
+        <w:rPr>
+          <w:rFonts w:ascii="Helvetica" w:hAnsi="Helvetica" w:cs="Helvetica"/>
+          <w:sz w:val="25"/>
+          <w:sz-cs w:val="25"/>
+          <w:spacing w:val="0"/>
+          <w:color w:val="151312"/>
+        </w:rPr>
+        <w:t xml:space="preserve">Delayed quotes and candles</w:t>
+      </w:r>
+    </w:p>
+    <w:p>
+      <w:pPr/>
+      <w:r>
+        <w:rPr>
+          <w:rFonts w:ascii="Helvetica" w:hAnsi="Helvetica" w:cs="Helvetica"/>
+          <w:sz w:val="25"/>
+          <w:sz-cs w:val="25"/>
+          <w:spacing w:val="0"/>
+          <w:color w:val="151312"/>
+        </w:rPr>
+        <w:t xml:space="preserve">Not stored. Fetched from Yahoo per request</w:t>
+      </w:r>
+    </w:p>
+    <w:p>
+      <w:pPr/>
+      <w:r>
+        <w:rPr>
+          <w:rFonts w:ascii="Helvetica" w:hAnsi="Helvetica" w:cs="Helvetica"/>
+          <w:sz w:val="25"/>
+          <w:sz-cs w:val="25"/>
+          <w:spacing w:val="0"/>
+          <w:color w:val="151312"/>
+        </w:rPr>
         <w:t xml:space="preserve">Orders, fills, positions, credentials</w:t>
       </w:r>
     </w:p>
@@ -37426,6 +38899,19 @@
         </w:rPr>
         <w:t xml:space="preserve">  strategy_improvements ||--o{ improvement_decisions : decided</w:t>
       </w:r>
+    </w:p>
+    <w:p>
+      <w:pPr/>
+      <w:r>
+        <w:rPr>
+          <w:rFonts w:ascii=".AppleSystemUIFontMonospaced" w:hAnsi=".AppleSystemUIFontMonospaced" w:cs=".AppleSystemUIFontMonospaced"/>
+          <w:sz w:val="23"/>
+          <w:sz-cs w:val="23"/>
+          <w:spacing w:val="0"/>
+          <w:color w:val="151312"/>
+        </w:rPr>
+        <w:t xml:space="preserve">  strategies |o--o{ paper_orders : tags</w:t>
+      </w:r>
       <w:r>
         <w:rPr>
           <w:rFonts w:ascii="Courier" w:hAnsi="Courier" w:cs="Courier"/>
@@ -37948,7 +39434,7 @@
           <w:spacing w:val="0"/>
           <w:color w:val="151312"/>
         </w:rPr>
-        <w:t xml:space="preserve">backend/alembic/versions/0005_sim_v3.py</w:t>
+        <w:t xml:space="preserve">backend/alembic/versions/0006_paper_orders.py</w:t>
       </w:r>
       <w:r>
         <w:rPr>

</xml_diff>